<commit_message>
share/22m: illustrated guide v2 (every step, Sakkal Majalla), western digits in share dialog
Co-Authored-By: Claude Opus 5.5 <noreply@anthropic.com>
Claude-Session: https://claude.ai/code/session_01WenU9YfZxHDgmNpcDVSGAM
</commit_message>
<xml_diff>
--- a/share/22m/دليل-رئيس-الفريق.docx
+++ b/share/22m/دليل-رئيس-الفريق.docx
@@ -13,9 +13,9 @@
           <w:rFonts w:ascii="Sakkal Majalla" w:hAnsi="Sakkal Majalla" w:cs="Sakkal Majalla" w:eastAsia="Sakkal Majalla"/>
           <w:b/>
           <w:color w:val="0D6B63"/>
-          <w:sz w:val="48"/>
+          <w:sz w:val="60"/>
           <w:bCs/>
-          <w:szCs w:val="48"/>
+          <w:szCs w:val="60"/>
         </w:rPr>
         <w:t>دليل رئيس الفريق المصوّر</w:t>
       </w:r>
@@ -31,8 +31,8 @@
           <w:rFonts w:ascii="Sakkal Majalla" w:hAnsi="Sakkal Majalla" w:cs="Sakkal Majalla" w:eastAsia="Sakkal Majalla"/>
           <w:b w:val="0"/>
           <w:color w:val="444444"/>
-          <w:sz w:val="32"/>
-          <w:szCs w:val="32"/>
+          <w:sz w:val="38"/>
+          <w:szCs w:val="38"/>
         </w:rPr>
         <w:t>نموذج تقويم المعايير للمراجعة المكتبية ثم الميدانية</w:t>
       </w:r>
@@ -48,11 +48,11 @@
           <w:rFonts w:ascii="Sakkal Majalla" w:hAnsi="Sakkal Majalla" w:cs="Sakkal Majalla" w:eastAsia="Sakkal Majalla"/>
           <w:b/>
           <w:color w:val="8A6D1D"/>
-          <w:sz w:val="28"/>
+          <w:sz w:val="34"/>
           <w:bCs/>
-          <w:szCs w:val="28"/>
+          <w:szCs w:val="34"/>
         </w:rPr>
-        <w:t>إعداد المهندس/ علي الأحمري</w:t>
+        <w:t>إعداد المهندس/ علي سعد الأحمري</w:t>
       </w:r>
     </w:p>
     <w:p>
@@ -66,8 +66,8 @@
           <w:rFonts w:ascii="Sakkal Majalla" w:hAnsi="Sakkal Majalla" w:cs="Sakkal Majalla" w:eastAsia="Sakkal Majalla"/>
           <w:b w:val="0"/>
           <w:color w:val="555555"/>
-          <w:sz w:val="24"/>
-          <w:szCs w:val="24"/>
+          <w:sz w:val="28"/>
+          <w:szCs w:val="28"/>
         </w:rPr>
         <w:t>جميع الحقوق محفوظة 2026، ولا يجوز تعديل النموذج دون إذن كتابي من المُعِدّ.</w:t>
       </w:r>
@@ -83,9 +83,9 @@
           <w:rFonts w:ascii="Sakkal Majalla" w:hAnsi="Sakkal Majalla" w:cs="Sakkal Majalla" w:eastAsia="Sakkal Majalla"/>
           <w:b/>
           <w:color w:val="0D6B63"/>
-          <w:sz w:val="34"/>
+          <w:sz w:val="40"/>
           <w:bCs/>
-          <w:szCs w:val="34"/>
+          <w:szCs w:val="40"/>
         </w:rPr>
         <w:t>قبل أن تبدأ</w:t>
       </w:r>
@@ -100,8 +100,8 @@
         <w:rPr>
           <w:rFonts w:ascii="Sakkal Majalla" w:hAnsi="Sakkal Majalla" w:cs="Sakkal Majalla" w:eastAsia="Sakkal Majalla"/>
           <w:b w:val="0"/>
-          <w:sz w:val="28"/>
-          <w:szCs w:val="28"/>
+          <w:sz w:val="32"/>
+          <w:szCs w:val="32"/>
         </w:rPr>
         <w:t>هذه النسخة مستقلة تمامًا بنماذجها وأكوادها وبوابتها. كل بياناتك تُحفظ في حسابك أنت في Google: جدول تعبئة الفريق، ومجلد شواهد المنشآت. لا يمر شيء منها عبر حساب المُعِدّ ولا يراه.</w:t>
       </w:r>
@@ -116,10 +116,67 @@
         <w:rPr>
           <w:rFonts w:ascii="Sakkal Majalla" w:hAnsi="Sakkal Majalla" w:cs="Sakkal Majalla" w:eastAsia="Sakkal Majalla"/>
           <w:b w:val="0"/>
+          <w:sz w:val="32"/>
+          <w:szCs w:val="32"/>
+        </w:rPr>
+        <w:t>تحتاج حساب Google وجهاز حاسب لخطوات الإعداد الأولى، وتستغرق نحو 10 دقائق مرة واحدة. بعدها يعمل النموذج من الجوال أو الحاسب.</w:t>
+      </w:r>
+    </w:p>
+    <w:p>
+      <w:pPr>
+        <w:spacing w:after="40"/>
+        <w:jc w:val="center"/>
+      </w:pPr>
+      <w:r>
+        <w:drawing>
+          <wp:inline xmlns:a="http://schemas.openxmlformats.org/drawingml/2006/main" xmlns:pic="http://schemas.openxmlformats.org/drawingml/2006/picture">
+            <wp:extent cx="5400000" cy="1567562"/>
+            <wp:docPr id="1" name="Picture 1"/>
+            <wp:cNvGraphicFramePr>
+              <a:graphicFrameLocks noChangeAspect="1"/>
+            </wp:cNvGraphicFramePr>
+            <a:graphic>
+              <a:graphicData uri="http://schemas.openxmlformats.org/drawingml/2006/picture">
+                <pic:pic>
+                  <pic:nvPicPr>
+                    <pic:cNvPr id="0" name="03-header.png"/>
+                    <pic:cNvPicPr/>
+                  </pic:nvPicPr>
+                  <pic:blipFill>
+                    <a:blip r:embed="rId9"/>
+                    <a:stretch>
+                      <a:fillRect/>
+                    </a:stretch>
+                  </pic:blipFill>
+                  <pic:spPr>
+                    <a:xfrm>
+                      <a:off x="0" y="0"/>
+                      <a:ext cx="5400000" cy="1567562"/>
+                    </a:xfrm>
+                    <a:prstGeom prst="rect"/>
+                  </pic:spPr>
+                </pic:pic>
+              </a:graphicData>
+            </a:graphic>
+          </wp:inline>
+        </w:drawing>
+      </w:r>
+    </w:p>
+    <w:p>
+      <w:pPr>
+        <w:spacing w:after="160" w:before="0"/>
+        <w:bidi/>
+        <w:jc w:val="center"/>
+      </w:pPr>
+      <w:r>
+        <w:rPr>
+          <w:rFonts w:ascii="Sakkal Majalla" w:hAnsi="Sakkal Majalla" w:cs="Sakkal Majalla" w:eastAsia="Sakkal Majalla"/>
+          <w:b w:val="0"/>
+          <w:color w:val="666666"/>
           <w:sz w:val="28"/>
           <w:szCs w:val="28"/>
         </w:rPr>
-        <w:t>تحتاج حساب Google وجهاز حاسب لخطوات الإعداد الأولى، وتستغرق نحو 10 دقائق مرة واحدة. بعدها يعمل النموذج من الجوال أو الحاسب.</w:t>
+        <w:t>واجهة النموذج</w:t>
       </w:r>
     </w:p>
     <w:p>
@@ -132,8 +189,8 @@
         <w:rPr>
           <w:rFonts w:ascii="Sakkal Majalla" w:hAnsi="Sakkal Majalla" w:cs="Sakkal Majalla" w:eastAsia="Sakkal Majalla"/>
           <w:b w:val="0"/>
-          <w:sz w:val="28"/>
-          <w:szCs w:val="28"/>
+          <w:sz w:val="32"/>
+          <w:szCs w:val="32"/>
         </w:rPr>
         <w:t>الصور المأخوذة من النموذج حقيقية. أما صور محرر Google فهي رسوم توضيحية مبسطة، وقد تظهر لك الأزرار بالعربية أو الإنجليزية حسب لغة حسابك.</w:t>
       </w:r>
@@ -149,9 +206,9 @@
           <w:rFonts w:ascii="Sakkal Majalla" w:hAnsi="Sakkal Majalla" w:cs="Sakkal Majalla" w:eastAsia="Sakkal Majalla"/>
           <w:b/>
           <w:color w:val="0D6B63"/>
-          <w:sz w:val="34"/>
+          <w:sz w:val="40"/>
           <w:bCs/>
-          <w:szCs w:val="34"/>
+          <w:szCs w:val="40"/>
         </w:rPr>
         <w:t>الخطوة 1: فتح النموذج</w:t>
       </w:r>
@@ -166,8 +223,8 @@
         <w:rPr>
           <w:rFonts w:ascii="Sakkal Majalla" w:hAnsi="Sakkal Majalla" w:cs="Sakkal Majalla" w:eastAsia="Sakkal Majalla"/>
           <w:b w:val="0"/>
-          <w:sz w:val="28"/>
-          <w:szCs w:val="28"/>
+          <w:sz w:val="32"/>
+          <w:szCs w:val="32"/>
         </w:rPr>
         <w:t>افتح الرابط التالي من متصفح Chrome، واحفظه في المفضلة:</w:t>
       </w:r>
@@ -183,9 +240,9 @@
           <w:rFonts w:ascii="Sakkal Majalla" w:hAnsi="Sakkal Majalla" w:cs="Sakkal Majalla" w:eastAsia="Sakkal Majalla"/>
           <w:b/>
           <w:color w:val="0D6B63"/>
-          <w:sz w:val="28"/>
+          <w:sz w:val="32"/>
           <w:bCs/>
-          <w:szCs w:val="28"/>
+          <w:szCs w:val="32"/>
           <w:rtl w:val="0"/>
         </w:rPr>
         <w:t>https://ali-alahmari.github.io/share/22m/</w:t>
@@ -201,8 +258,8 @@
         <w:rPr>
           <w:rFonts w:ascii="Sakkal Majalla" w:hAnsi="Sakkal Majalla" w:cs="Sakkal Majalla" w:eastAsia="Sakkal Majalla"/>
           <w:b w:val="0"/>
-          <w:sz w:val="28"/>
-          <w:szCs w:val="28"/>
+          <w:sz w:val="32"/>
+          <w:szCs w:val="32"/>
         </w:rPr>
         <w:t>أول مرة تظهر لك رسالة ترحيب، ثم دليل الاستخدام داخل النموذج.</w:t>
       </w:r>
@@ -216,7 +273,7 @@
         <w:drawing>
           <wp:inline xmlns:a="http://schemas.openxmlformats.org/drawingml/2006/main" xmlns:pic="http://schemas.openxmlformats.org/drawingml/2006/picture">
             <wp:extent cx="3960000" cy="2330308"/>
-            <wp:docPr id="1" name="Picture 1"/>
+            <wp:docPr id="2" name="Picture 2"/>
             <wp:cNvGraphicFramePr>
               <a:graphicFrameLocks noChangeAspect="1"/>
             </wp:cNvGraphicFramePr>
@@ -228,7 +285,7 @@
                     <pic:cNvPicPr/>
                   </pic:nvPicPr>
                   <pic:blipFill>
-                    <a:blip r:embed="rId9"/>
+                    <a:blip r:embed="rId10"/>
                     <a:stretch>
                       <a:fillRect/>
                     </a:stretch>
@@ -258,8 +315,8 @@
           <w:rFonts w:ascii="Sakkal Majalla" w:hAnsi="Sakkal Majalla" w:cs="Sakkal Majalla" w:eastAsia="Sakkal Majalla"/>
           <w:b w:val="0"/>
           <w:color w:val="666666"/>
-          <w:sz w:val="24"/>
-          <w:szCs w:val="24"/>
+          <w:sz w:val="28"/>
+          <w:szCs w:val="28"/>
         </w:rPr>
         <w:t>رسالة الترحيب عند أول فتح</w:t>
       </w:r>
@@ -273,7 +330,7 @@
         <w:drawing>
           <wp:inline xmlns:a="http://schemas.openxmlformats.org/drawingml/2006/main" xmlns:pic="http://schemas.openxmlformats.org/drawingml/2006/picture">
             <wp:extent cx="4320000" cy="2229677"/>
-            <wp:docPr id="2" name="Picture 2"/>
+            <wp:docPr id="3" name="Picture 3"/>
             <wp:cNvGraphicFramePr>
               <a:graphicFrameLocks noChangeAspect="1"/>
             </wp:cNvGraphicFramePr>
@@ -285,7 +342,7 @@
                     <pic:cNvPicPr/>
                   </pic:nvPicPr>
                   <pic:blipFill>
-                    <a:blip r:embed="rId10"/>
+                    <a:blip r:embed="rId11"/>
                     <a:stretch>
                       <a:fillRect/>
                     </a:stretch>
@@ -315,8 +372,8 @@
           <w:rFonts w:ascii="Sakkal Majalla" w:hAnsi="Sakkal Majalla" w:cs="Sakkal Majalla" w:eastAsia="Sakkal Majalla"/>
           <w:b w:val="0"/>
           <w:color w:val="666666"/>
-          <w:sz w:val="24"/>
-          <w:szCs w:val="24"/>
+          <w:sz w:val="28"/>
+          <w:szCs w:val="28"/>
         </w:rPr>
         <w:t>دليل الاستخدام داخل النموذج، ويمكن فتحه لاحقًا من زر «دليل الاستخدام»</w:t>
       </w:r>
@@ -332,9 +389,9 @@
           <w:rFonts w:ascii="Sakkal Majalla" w:hAnsi="Sakkal Majalla" w:cs="Sakkal Majalla" w:eastAsia="Sakkal Majalla"/>
           <w:b/>
           <w:color w:val="0D6B63"/>
-          <w:sz w:val="34"/>
+          <w:sz w:val="40"/>
           <w:bCs/>
-          <w:szCs w:val="34"/>
+          <w:szCs w:val="40"/>
         </w:rPr>
         <w:t>الخطوة 2: كتابة أسماء الفريق</w:t>
       </w:r>
@@ -349,8 +406,8 @@
         <w:rPr>
           <w:rFonts w:ascii="Sakkal Majalla" w:hAnsi="Sakkal Majalla" w:cs="Sakkal Majalla" w:eastAsia="Sakkal Majalla"/>
           <w:b w:val="0"/>
-          <w:sz w:val="28"/>
-          <w:szCs w:val="28"/>
+          <w:sz w:val="32"/>
+          <w:szCs w:val="32"/>
         </w:rPr>
         <w:t>في تبويب «نموذج تقويم المعايير» اكتب اسمك في الخانة الأولى، ثم أسماء الأعضاء. استخدم زر «إضافة عضو» لزيادة الخانات، واختر صفة كل واحد.</w:t>
       </w:r>
@@ -364,7 +421,7 @@
         <w:drawing>
           <wp:inline xmlns:a="http://schemas.openxmlformats.org/drawingml/2006/main" xmlns:pic="http://schemas.openxmlformats.org/drawingml/2006/picture">
             <wp:extent cx="5040000" cy="5149804"/>
-            <wp:docPr id="3" name="Picture 3"/>
+            <wp:docPr id="4" name="Picture 4"/>
             <wp:cNvGraphicFramePr>
               <a:graphicFrameLocks noChangeAspect="1"/>
             </wp:cNvGraphicFramePr>
@@ -376,7 +433,7 @@
                     <pic:cNvPicPr/>
                   </pic:nvPicPr>
                   <pic:blipFill>
-                    <a:blip r:embed="rId11"/>
+                    <a:blip r:embed="rId12"/>
                     <a:stretch>
                       <a:fillRect/>
                     </a:stretch>
@@ -406,8 +463,8 @@
           <w:rFonts w:ascii="Sakkal Majalla" w:hAnsi="Sakkal Majalla" w:cs="Sakkal Majalla" w:eastAsia="Sakkal Majalla"/>
           <w:b w:val="0"/>
           <w:color w:val="666666"/>
-          <w:sz w:val="24"/>
-          <w:szCs w:val="24"/>
+          <w:sz w:val="28"/>
+          <w:szCs w:val="28"/>
         </w:rPr>
         <w:t>خانات أسماء الفريق</w:t>
       </w:r>
@@ -423,9 +480,9 @@
           <w:rFonts w:ascii="Sakkal Majalla" w:hAnsi="Sakkal Majalla" w:cs="Sakkal Majalla" w:eastAsia="Sakkal Majalla"/>
           <w:b/>
           <w:color w:val="0D6B63"/>
-          <w:sz w:val="34"/>
+          <w:sz w:val="40"/>
           <w:bCs/>
-          <w:szCs w:val="34"/>
+          <w:szCs w:val="40"/>
         </w:rPr>
         <w:t>الخطوة 3: ربط النموذج بجدول في حسابك</w:t>
       </w:r>
@@ -440,8 +497,8 @@
         <w:rPr>
           <w:rFonts w:ascii="Sakkal Majalla" w:hAnsi="Sakkal Majalla" w:cs="Sakkal Majalla" w:eastAsia="Sakkal Majalla"/>
           <w:b w:val="0"/>
-          <w:sz w:val="28"/>
-          <w:szCs w:val="28"/>
+          <w:sz w:val="32"/>
+          <w:szCs w:val="32"/>
         </w:rPr>
         <w:t>اضغط زر «مشاركة الفريق» في أعلى النموذج. تظهر نافذة فيها الخطوات وكود جاهز.</w:t>
       </w:r>
@@ -455,7 +512,7 @@
         <w:drawing>
           <wp:inline xmlns:a="http://schemas.openxmlformats.org/drawingml/2006/main" xmlns:pic="http://schemas.openxmlformats.org/drawingml/2006/picture">
             <wp:extent cx="4680000" cy="4877053"/>
-            <wp:docPr id="4" name="Picture 4"/>
+            <wp:docPr id="5" name="Picture 5"/>
             <wp:cNvGraphicFramePr>
               <a:graphicFrameLocks noChangeAspect="1"/>
             </wp:cNvGraphicFramePr>
@@ -467,7 +524,7 @@
                     <pic:cNvPicPr/>
                   </pic:nvPicPr>
                   <pic:blipFill>
-                    <a:blip r:embed="rId12"/>
+                    <a:blip r:embed="rId13"/>
                     <a:stretch>
                       <a:fillRect/>
                     </a:stretch>
@@ -497,8 +554,8 @@
           <w:rFonts w:ascii="Sakkal Majalla" w:hAnsi="Sakkal Majalla" w:cs="Sakkal Majalla" w:eastAsia="Sakkal Majalla"/>
           <w:b w:val="0"/>
           <w:color w:val="666666"/>
-          <w:sz w:val="24"/>
-          <w:szCs w:val="24"/>
+          <w:sz w:val="28"/>
+          <w:szCs w:val="28"/>
         </w:rPr>
         <w:t>نافذة مشاركة الفريق: اكتب رمزًا سريًا للفريق إن أردت، ثم اضغط «نسخ الكود»</w:t>
       </w:r>
@@ -513,8 +570,8 @@
         <w:rPr>
           <w:rFonts w:ascii="Sakkal Majalla" w:hAnsi="Sakkal Majalla" w:cs="Sakkal Majalla" w:eastAsia="Sakkal Majalla"/>
           <w:b w:val="0"/>
-          <w:sz w:val="28"/>
-          <w:szCs w:val="28"/>
+          <w:sz w:val="32"/>
+          <w:szCs w:val="32"/>
         </w:rPr>
         <w:t>افتح في تبويب جديد الرابط script.new، والصق الكود واحفظ، ثم شغّل الدالة setup.</w:t>
       </w:r>
@@ -528,7 +585,7 @@
         <w:drawing>
           <wp:inline xmlns:a="http://schemas.openxmlformats.org/drawingml/2006/main" xmlns:pic="http://schemas.openxmlformats.org/drawingml/2006/picture">
             <wp:extent cx="5580000" cy="2356000"/>
-            <wp:docPr id="5" name="Picture 5"/>
+            <wp:docPr id="6" name="Picture 6"/>
             <wp:cNvGraphicFramePr>
               <a:graphicFrameLocks noChangeAspect="1"/>
             </wp:cNvGraphicFramePr>
@@ -540,7 +597,7 @@
                     <pic:cNvPicPr/>
                   </pic:nvPicPr>
                   <pic:blipFill>
-                    <a:blip r:embed="rId13"/>
+                    <a:blip r:embed="rId14"/>
                     <a:stretch>
                       <a:fillRect/>
                     </a:stretch>
@@ -569,8 +626,8 @@
         <w:rPr>
           <w:rFonts w:ascii="Sakkal Majalla" w:hAnsi="Sakkal Majalla" w:cs="Sakkal Majalla" w:eastAsia="Sakkal Majalla"/>
           <w:b w:val="0"/>
-          <w:sz w:val="28"/>
-          <w:szCs w:val="28"/>
+          <w:sz w:val="32"/>
+          <w:szCs w:val="32"/>
         </w:rPr>
         <w:t>عند أول تشغيل يطلب Google الموافقة على الصلاحيات. هذا طبيعي لأن المشروع في حسابك أنت.</w:t>
       </w:r>
@@ -584,7 +641,7 @@
         <w:drawing>
           <wp:inline xmlns:a="http://schemas.openxmlformats.org/drawingml/2006/main" xmlns:pic="http://schemas.openxmlformats.org/drawingml/2006/picture">
             <wp:extent cx="5580000" cy="3013200"/>
-            <wp:docPr id="6" name="Picture 6"/>
+            <wp:docPr id="7" name="Picture 7"/>
             <wp:cNvGraphicFramePr>
               <a:graphicFrameLocks noChangeAspect="1"/>
             </wp:cNvGraphicFramePr>
@@ -596,7 +653,7 @@
                     <pic:cNvPicPr/>
                   </pic:nvPicPr>
                   <pic:blipFill>
-                    <a:blip r:embed="rId14"/>
+                    <a:blip r:embed="rId15"/>
                     <a:stretch>
                       <a:fillRect/>
                     </a:stretch>
@@ -625,8 +682,8 @@
         <w:rPr>
           <w:rFonts w:ascii="Sakkal Majalla" w:hAnsi="Sakkal Majalla" w:cs="Sakkal Majalla" w:eastAsia="Sakkal Majalla"/>
           <w:b w:val="0"/>
-          <w:sz w:val="28"/>
-          <w:szCs w:val="28"/>
+          <w:sz w:val="32"/>
+          <w:szCs w:val="32"/>
         </w:rPr>
         <w:t>بعد نجاح التشغيل اضغط Deploy ثم New deployment، واضبط الخيارات كما في الرسم.</w:t>
       </w:r>
@@ -640,7 +697,7 @@
         <w:drawing>
           <wp:inline xmlns:a="http://schemas.openxmlformats.org/drawingml/2006/main" xmlns:pic="http://schemas.openxmlformats.org/drawingml/2006/picture">
             <wp:extent cx="5040000" cy="2385600"/>
-            <wp:docPr id="7" name="Picture 7"/>
+            <wp:docPr id="8" name="Picture 8"/>
             <wp:cNvGraphicFramePr>
               <a:graphicFrameLocks noChangeAspect="1"/>
             </wp:cNvGraphicFramePr>
@@ -652,7 +709,7 @@
                     <pic:cNvPicPr/>
                   </pic:nvPicPr>
                   <pic:blipFill>
-                    <a:blip r:embed="rId15"/>
+                    <a:blip r:embed="rId16"/>
                     <a:stretch>
                       <a:fillRect/>
                     </a:stretch>
@@ -680,7 +737,7 @@
         <w:drawing>
           <wp:inline xmlns:a="http://schemas.openxmlformats.org/drawingml/2006/main" xmlns:pic="http://schemas.openxmlformats.org/drawingml/2006/picture">
             <wp:extent cx="5040000" cy="1932000"/>
-            <wp:docPr id="8" name="Picture 8"/>
+            <wp:docPr id="9" name="Picture 9"/>
             <wp:cNvGraphicFramePr>
               <a:graphicFrameLocks noChangeAspect="1"/>
             </wp:cNvGraphicFramePr>
@@ -692,7 +749,7 @@
                     <pic:cNvPicPr/>
                   </pic:nvPicPr>
                   <pic:blipFill>
-                    <a:blip r:embed="rId16"/>
+                    <a:blip r:embed="rId17"/>
                     <a:stretch>
                       <a:fillRect/>
                     </a:stretch>
@@ -721,10 +778,67 @@
         <w:rPr>
           <w:rFonts w:ascii="Sakkal Majalla" w:hAnsi="Sakkal Majalla" w:cs="Sakkal Majalla" w:eastAsia="Sakkal Majalla"/>
           <w:b w:val="0"/>
+          <w:sz w:val="32"/>
+          <w:szCs w:val="32"/>
+        </w:rPr>
+        <w:t>ارجع إلى نافذة «مشاركة الفريق» في النموذج، والصق الرابط في خانة «رابط تطبيق الويب»، ثم اضغط «اختبار وربط». تظهر عبارة «تم الربط» عند النجاح.</w:t>
+      </w:r>
+    </w:p>
+    <w:p>
+      <w:pPr>
+        <w:spacing w:after="40"/>
+        <w:jc w:val="center"/>
+      </w:pPr>
+      <w:r>
+        <w:drawing>
+          <wp:inline xmlns:a="http://schemas.openxmlformats.org/drawingml/2006/main" xmlns:pic="http://schemas.openxmlformats.org/drawingml/2006/picture">
+            <wp:extent cx="4320000" cy="4368000"/>
+            <wp:docPr id="10" name="Picture 10"/>
+            <wp:cNvGraphicFramePr>
+              <a:graphicFrameLocks noChangeAspect="1"/>
+            </wp:cNvGraphicFramePr>
+            <a:graphic>
+              <a:graphicData uri="http://schemas.openxmlformats.org/drawingml/2006/picture">
+                <pic:pic>
+                  <pic:nvPicPr>
+                    <pic:cNvPr id="0" name="05-share-linked.png"/>
+                    <pic:cNvPicPr/>
+                  </pic:nvPicPr>
+                  <pic:blipFill>
+                    <a:blip r:embed="rId18"/>
+                    <a:stretch>
+                      <a:fillRect/>
+                    </a:stretch>
+                  </pic:blipFill>
+                  <pic:spPr>
+                    <a:xfrm>
+                      <a:off x="0" y="0"/>
+                      <a:ext cx="4320000" cy="4368000"/>
+                    </a:xfrm>
+                    <a:prstGeom prst="rect"/>
+                  </pic:spPr>
+                </pic:pic>
+              </a:graphicData>
+            </a:graphic>
+          </wp:inline>
+        </w:drawing>
+      </w:r>
+    </w:p>
+    <w:p>
+      <w:pPr>
+        <w:spacing w:after="160" w:before="0"/>
+        <w:bidi/>
+        <w:jc w:val="center"/>
+      </w:pPr>
+      <w:r>
+        <w:rPr>
+          <w:rFonts w:ascii="Sakkal Majalla" w:hAnsi="Sakkal Majalla" w:cs="Sakkal Majalla" w:eastAsia="Sakkal Majalla"/>
+          <w:b w:val="0"/>
+          <w:color w:val="666666"/>
           <w:sz w:val="28"/>
           <w:szCs w:val="28"/>
         </w:rPr>
-        <w:t>ارجع إلى نافذة «مشاركة الفريق» في النموذج، والصق الرابط في خانة «رابط تطبيق الويب»، ثم اضغط «اختبار وربط». تظهر عبارة «تم الربط» عند النجاح.</w:t>
+        <w:t>لصق الرابط ثم «اختبار وربط»، وتظهر عبارة «تم الربط»</w:t>
       </w:r>
     </w:p>
     <w:p>
@@ -738,9 +852,9 @@
           <w:rFonts w:ascii="Sakkal Majalla" w:hAnsi="Sakkal Majalla" w:cs="Sakkal Majalla" w:eastAsia="Sakkal Majalla"/>
           <w:b/>
           <w:color w:val="0D6B63"/>
-          <w:sz w:val="34"/>
+          <w:sz w:val="40"/>
           <w:bCs/>
-          <w:szCs w:val="34"/>
+          <w:szCs w:val="40"/>
         </w:rPr>
         <w:t>الخطوة 4: إرسال الروابط للفريق</w:t>
       </w:r>
@@ -755,8 +869,8 @@
         <w:rPr>
           <w:rFonts w:ascii="Sakkal Majalla" w:hAnsi="Sakkal Majalla" w:cs="Sakkal Majalla" w:eastAsia="Sakkal Majalla"/>
           <w:b w:val="0"/>
-          <w:sz w:val="28"/>
-          <w:szCs w:val="28"/>
+          <w:sz w:val="32"/>
+          <w:szCs w:val="32"/>
         </w:rPr>
         <w:t>بعد الربط يظهر لكل عضو رابط شخصي يثبّت اسمه. اضغط «نسخ رابطه» وأرسله له.</w:t>
       </w:r>
@@ -771,8 +885,8 @@
         <w:rPr>
           <w:rFonts w:ascii="Sakkal Majalla" w:hAnsi="Sakkal Majalla" w:cs="Sakkal Majalla" w:eastAsia="Sakkal Majalla"/>
           <w:b w:val="0"/>
-          <w:sz w:val="28"/>
-          <w:szCs w:val="28"/>
+          <w:sz w:val="32"/>
+          <w:szCs w:val="32"/>
         </w:rPr>
         <w:t>احتفظ بـ«رابط الرئيس» لنفسك ولا ترسله لأحد، فهو الذي يفتح لك النموذج بصلاحية الرئيس من أي جهاز.</w:t>
       </w:r>
@@ -786,7 +900,7 @@
         <w:drawing>
           <wp:inline xmlns:a="http://schemas.openxmlformats.org/drawingml/2006/main" xmlns:pic="http://schemas.openxmlformats.org/drawingml/2006/picture">
             <wp:extent cx="4680000" cy="4877053"/>
-            <wp:docPr id="9" name="Picture 9"/>
+            <wp:docPr id="11" name="Picture 11"/>
             <wp:cNvGraphicFramePr>
               <a:graphicFrameLocks noChangeAspect="1"/>
             </wp:cNvGraphicFramePr>
@@ -798,7 +912,7 @@
                     <pic:cNvPicPr/>
                   </pic:nvPicPr>
                   <pic:blipFill>
-                    <a:blip r:embed="rId17"/>
+                    <a:blip r:embed="rId19"/>
                     <a:stretch>
                       <a:fillRect/>
                     </a:stretch>
@@ -828,10 +942,10 @@
           <w:rFonts w:ascii="Sakkal Majalla" w:hAnsi="Sakkal Majalla" w:cs="Sakkal Majalla" w:eastAsia="Sakkal Majalla"/>
           <w:b w:val="0"/>
           <w:color w:val="666666"/>
-          <w:sz w:val="24"/>
-          <w:szCs w:val="24"/>
+          <w:sz w:val="28"/>
+          <w:szCs w:val="28"/>
         </w:rPr>
-        <w:t>عبارة «تم الربط» في الأعلى، ثم روابط الأعضاء ورابط الرئيس</w:t>
+        <w:t>روابط الأعضاء ورابط الرئيس</w:t>
       </w:r>
     </w:p>
     <w:p>
@@ -845,9 +959,9 @@
           <w:rFonts w:ascii="Sakkal Majalla" w:hAnsi="Sakkal Majalla" w:cs="Sakkal Majalla" w:eastAsia="Sakkal Majalla"/>
           <w:b/>
           <w:color w:val="0D6B63"/>
-          <w:sz w:val="34"/>
+          <w:sz w:val="40"/>
           <w:bCs/>
-          <w:szCs w:val="34"/>
+          <w:szCs w:val="40"/>
         </w:rPr>
         <w:t>الخطوة 5: بوابة الشواهد الخاصة بك</w:t>
       </w:r>
@@ -862,8 +976,8 @@
         <w:rPr>
           <w:rFonts w:ascii="Sakkal Majalla" w:hAnsi="Sakkal Majalla" w:cs="Sakkal Majalla" w:eastAsia="Sakkal Majalla"/>
           <w:b w:val="0"/>
-          <w:sz w:val="28"/>
-          <w:szCs w:val="28"/>
+          <w:sz w:val="32"/>
+          <w:szCs w:val="32"/>
         </w:rPr>
         <w:t>البوابة تستقبل شواهد المنشأة في مجلد Drive في حسابك. افتح تبويب «طلب الشواهد من المنشأة»، ثم «إنشاء بوابة الشواهد الخاصة بي»، واضغط «نسخ كود البوابة».</w:t>
       </w:r>
@@ -877,7 +991,7 @@
         <w:drawing>
           <wp:inline xmlns:a="http://schemas.openxmlformats.org/drawingml/2006/main" xmlns:pic="http://schemas.openxmlformats.org/drawingml/2006/picture">
             <wp:extent cx="5400000" cy="2964706"/>
-            <wp:docPr id="10" name="Picture 10"/>
+            <wp:docPr id="12" name="Picture 12"/>
             <wp:cNvGraphicFramePr>
               <a:graphicFrameLocks noChangeAspect="1"/>
             </wp:cNvGraphicFramePr>
@@ -889,7 +1003,7 @@
                     <pic:cNvPicPr/>
                   </pic:nvPicPr>
                   <pic:blipFill>
-                    <a:blip r:embed="rId18"/>
+                    <a:blip r:embed="rId20"/>
                     <a:stretch>
                       <a:fillRect/>
                     </a:stretch>
@@ -919,8 +1033,8 @@
           <w:rFonts w:ascii="Sakkal Majalla" w:hAnsi="Sakkal Majalla" w:cs="Sakkal Majalla" w:eastAsia="Sakkal Majalla"/>
           <w:b w:val="0"/>
           <w:color w:val="666666"/>
-          <w:sz w:val="24"/>
-          <w:szCs w:val="24"/>
+          <w:sz w:val="28"/>
+          <w:szCs w:val="28"/>
         </w:rPr>
         <w:t>قسم إنشاء البوابة وكودها</w:t>
       </w:r>
@@ -935,10 +1049,124 @@
         <w:rPr>
           <w:rFonts w:ascii="Sakkal Majalla" w:hAnsi="Sakkal Majalla" w:cs="Sakkal Majalla" w:eastAsia="Sakkal Majalla"/>
           <w:b w:val="0"/>
+          <w:sz w:val="32"/>
+          <w:szCs w:val="32"/>
+        </w:rPr>
+        <w:t>افتح script.new جديدًا غير مشروع الجدول، والصق كود البوابة واحفظ، وشغّل setup ووافق على الصلاحيات كما في الخطوة 3.</w:t>
+      </w:r>
+    </w:p>
+    <w:p>
+      <w:pPr>
+        <w:spacing w:after="40"/>
+        <w:jc w:val="center"/>
+      </w:pPr>
+      <w:r>
+        <w:drawing>
+          <wp:inline xmlns:a="http://schemas.openxmlformats.org/drawingml/2006/main" xmlns:pic="http://schemas.openxmlformats.org/drawingml/2006/picture">
+            <wp:extent cx="5040000" cy="2128000"/>
+            <wp:docPr id="13" name="Picture 13"/>
+            <wp:cNvGraphicFramePr>
+              <a:graphicFrameLocks noChangeAspect="1"/>
+            </wp:cNvGraphicFramePr>
+            <a:graphic>
+              <a:graphicData uri="http://schemas.openxmlformats.org/drawingml/2006/picture">
+                <pic:pic>
+                  <pic:nvPicPr>
+                    <pic:cNvPr id="0" name="d1.png"/>
+                    <pic:cNvPicPr/>
+                  </pic:nvPicPr>
+                  <pic:blipFill>
+                    <a:blip r:embed="rId14"/>
+                    <a:stretch>
+                      <a:fillRect/>
+                    </a:stretch>
+                  </pic:blipFill>
+                  <pic:spPr>
+                    <a:xfrm>
+                      <a:off x="0" y="0"/>
+                      <a:ext cx="5040000" cy="2128000"/>
+                    </a:xfrm>
+                    <a:prstGeom prst="rect"/>
+                  </pic:spPr>
+                </pic:pic>
+              </a:graphicData>
+            </a:graphic>
+          </wp:inline>
+        </w:drawing>
+      </w:r>
+    </w:p>
+    <w:p>
+      <w:pPr>
+        <w:spacing w:after="160" w:before="0"/>
+        <w:bidi/>
+        <w:jc w:val="center"/>
+      </w:pPr>
+      <w:r>
+        <w:rPr>
+          <w:rFonts w:ascii="Sakkal Majalla" w:hAnsi="Sakkal Majalla" w:cs="Sakkal Majalla" w:eastAsia="Sakkal Majalla"/>
+          <w:b w:val="0"/>
+          <w:color w:val="666666"/>
           <w:sz w:val="28"/>
           <w:szCs w:val="28"/>
         </w:rPr>
-        <w:t>افتح script.new جديدًا غير مشروع الجدول، والصق كود البوابة واحفظ، وشغّل setup ووافق على الصلاحيات كما في الخطوة 3.</w:t>
+        <w:t>الخطوات نفسها مع كود البوابة</w:t>
+      </w:r>
+    </w:p>
+    <w:p>
+      <w:pPr>
+        <w:spacing w:after="40"/>
+        <w:jc w:val="center"/>
+      </w:pPr>
+      <w:r>
+        <w:drawing>
+          <wp:inline xmlns:a="http://schemas.openxmlformats.org/drawingml/2006/main" xmlns:pic="http://schemas.openxmlformats.org/drawingml/2006/picture">
+            <wp:extent cx="5040000" cy="2721600"/>
+            <wp:docPr id="14" name="Picture 14"/>
+            <wp:cNvGraphicFramePr>
+              <a:graphicFrameLocks noChangeAspect="1"/>
+            </wp:cNvGraphicFramePr>
+            <a:graphic>
+              <a:graphicData uri="http://schemas.openxmlformats.org/drawingml/2006/picture">
+                <pic:pic>
+                  <pic:nvPicPr>
+                    <pic:cNvPr id="0" name="d2.png"/>
+                    <pic:cNvPicPr/>
+                  </pic:nvPicPr>
+                  <pic:blipFill>
+                    <a:blip r:embed="rId15"/>
+                    <a:stretch>
+                      <a:fillRect/>
+                    </a:stretch>
+                  </pic:blipFill>
+                  <pic:spPr>
+                    <a:xfrm>
+                      <a:off x="0" y="0"/>
+                      <a:ext cx="5040000" cy="2721600"/>
+                    </a:xfrm>
+                    <a:prstGeom prst="rect"/>
+                  </pic:spPr>
+                </pic:pic>
+              </a:graphicData>
+            </a:graphic>
+          </wp:inline>
+        </w:drawing>
+      </w:r>
+    </w:p>
+    <w:p>
+      <w:pPr>
+        <w:spacing w:after="160" w:before="0"/>
+        <w:bidi/>
+        <w:jc w:val="center"/>
+      </w:pPr>
+      <w:r>
+        <w:rPr>
+          <w:rFonts w:ascii="Sakkal Majalla" w:hAnsi="Sakkal Majalla" w:cs="Sakkal Majalla" w:eastAsia="Sakkal Majalla"/>
+          <w:b w:val="0"/>
+          <w:color w:val="666666"/>
+          <w:sz w:val="28"/>
+          <w:szCs w:val="28"/>
+        </w:rPr>
+        <w:t>الموافقة على الصلاحيات</w:t>
       </w:r>
     </w:p>
     <w:p>
@@ -951,8 +1179,8 @@
         <w:rPr>
           <w:rFonts w:ascii="Sakkal Majalla" w:hAnsi="Sakkal Majalla" w:cs="Sakkal Majalla" w:eastAsia="Sakkal Majalla"/>
           <w:b w:val="0"/>
-          <w:sz w:val="28"/>
-          <w:szCs w:val="28"/>
+          <w:sz w:val="32"/>
+          <w:szCs w:val="32"/>
         </w:rPr>
         <w:t>بعد التشغيل افتح سجل التنفيذ أسفل المحرر، وانسخ كلمة سر الفريق في البوابة.</w:t>
       </w:r>
@@ -966,7 +1194,7 @@
         <w:drawing>
           <wp:inline xmlns:a="http://schemas.openxmlformats.org/drawingml/2006/main" xmlns:pic="http://schemas.openxmlformats.org/drawingml/2006/picture">
             <wp:extent cx="5580000" cy="1773200"/>
-            <wp:docPr id="11" name="Picture 11"/>
+            <wp:docPr id="15" name="Picture 15"/>
             <wp:cNvGraphicFramePr>
               <a:graphicFrameLocks noChangeAspect="1"/>
             </wp:cNvGraphicFramePr>
@@ -978,7 +1206,7 @@
                     <pic:cNvPicPr/>
                   </pic:nvPicPr>
                   <pic:blipFill>
-                    <a:blip r:embed="rId19"/>
+                    <a:blip r:embed="rId21"/>
                     <a:stretch>
                       <a:fillRect/>
                     </a:stretch>
@@ -1007,10 +1235,90 @@
         <w:rPr>
           <w:rFonts w:ascii="Sakkal Majalla" w:hAnsi="Sakkal Majalla" w:cs="Sakkal Majalla" w:eastAsia="Sakkal Majalla"/>
           <w:b w:val="0"/>
-          <w:sz w:val="28"/>
-          <w:szCs w:val="28"/>
+          <w:sz w:val="32"/>
+          <w:szCs w:val="32"/>
         </w:rPr>
         <w:t>انشر المشروع بالطريقة نفسها: Deploy ثم New deployment ثم Web app ثم Me ثم Anyone، وانسخ الرابط المنتهي بـ exec.</w:t>
+      </w:r>
+    </w:p>
+    <w:p>
+      <w:pPr>
+        <w:spacing w:after="40"/>
+        <w:jc w:val="center"/>
+      </w:pPr>
+      <w:r>
+        <w:drawing>
+          <wp:inline xmlns:a="http://schemas.openxmlformats.org/drawingml/2006/main" xmlns:pic="http://schemas.openxmlformats.org/drawingml/2006/picture">
+            <wp:extent cx="4680000" cy="2215200"/>
+            <wp:docPr id="16" name="Picture 16"/>
+            <wp:cNvGraphicFramePr>
+              <a:graphicFrameLocks noChangeAspect="1"/>
+            </wp:cNvGraphicFramePr>
+            <a:graphic>
+              <a:graphicData uri="http://schemas.openxmlformats.org/drawingml/2006/picture">
+                <pic:pic>
+                  <pic:nvPicPr>
+                    <pic:cNvPr id="0" name="d3.png"/>
+                    <pic:cNvPicPr/>
+                  </pic:nvPicPr>
+                  <pic:blipFill>
+                    <a:blip r:embed="rId16"/>
+                    <a:stretch>
+                      <a:fillRect/>
+                    </a:stretch>
+                  </pic:blipFill>
+                  <pic:spPr>
+                    <a:xfrm>
+                      <a:off x="0" y="0"/>
+                      <a:ext cx="4680000" cy="2215200"/>
+                    </a:xfrm>
+                    <a:prstGeom prst="rect"/>
+                  </pic:spPr>
+                </pic:pic>
+              </a:graphicData>
+            </a:graphic>
+          </wp:inline>
+        </w:drawing>
+      </w:r>
+    </w:p>
+    <w:p>
+      <w:pPr>
+        <w:spacing w:after="40"/>
+        <w:jc w:val="center"/>
+      </w:pPr>
+      <w:r>
+        <w:drawing>
+          <wp:inline xmlns:a="http://schemas.openxmlformats.org/drawingml/2006/main" xmlns:pic="http://schemas.openxmlformats.org/drawingml/2006/picture">
+            <wp:extent cx="4680000" cy="1794000"/>
+            <wp:docPr id="17" name="Picture 17"/>
+            <wp:cNvGraphicFramePr>
+              <a:graphicFrameLocks noChangeAspect="1"/>
+            </wp:cNvGraphicFramePr>
+            <a:graphic>
+              <a:graphicData uri="http://schemas.openxmlformats.org/drawingml/2006/picture">
+                <pic:pic>
+                  <pic:nvPicPr>
+                    <pic:cNvPr id="0" name="d4.png"/>
+                    <pic:cNvPicPr/>
+                  </pic:nvPicPr>
+                  <pic:blipFill>
+                    <a:blip r:embed="rId17"/>
+                    <a:stretch>
+                      <a:fillRect/>
+                    </a:stretch>
+                  </pic:blipFill>
+                  <pic:spPr>
+                    <a:xfrm>
+                      <a:off x="0" y="0"/>
+                      <a:ext cx="4680000" cy="1794000"/>
+                    </a:xfrm>
+                    <a:prstGeom prst="rect"/>
+                  </pic:spPr>
+                </pic:pic>
+              </a:graphicData>
+            </a:graphic>
+          </wp:inline>
+        </w:drawing>
       </w:r>
     </w:p>
     <w:p>
@@ -1023,8 +1331,8 @@
         <w:rPr>
           <w:rFonts w:ascii="Sakkal Majalla" w:hAnsi="Sakkal Majalla" w:cs="Sakkal Majalla" w:eastAsia="Sakkal Majalla"/>
           <w:b w:val="0"/>
-          <w:sz w:val="28"/>
-          <w:szCs w:val="28"/>
+          <w:sz w:val="32"/>
+          <w:szCs w:val="32"/>
         </w:rPr>
         <w:t>في النموذج افتح «إعداد الربط مع البوابة»، والصق الرابط وكلمة السر، واضغط «حفظ على هذا الجهاز».</w:t>
       </w:r>
@@ -1038,7 +1346,7 @@
         <w:drawing>
           <wp:inline xmlns:a="http://schemas.openxmlformats.org/drawingml/2006/main" xmlns:pic="http://schemas.openxmlformats.org/drawingml/2006/picture">
             <wp:extent cx="5400000" cy="952941"/>
-            <wp:docPr id="12" name="Picture 12"/>
+            <wp:docPr id="18" name="Picture 18"/>
             <wp:cNvGraphicFramePr>
               <a:graphicFrameLocks noChangeAspect="1"/>
             </wp:cNvGraphicFramePr>
@@ -1050,7 +1358,7 @@
                     <pic:cNvPicPr/>
                   </pic:nvPicPr>
                   <pic:blipFill>
-                    <a:blip r:embed="rId20"/>
+                    <a:blip r:embed="rId22"/>
                     <a:stretch>
                       <a:fillRect/>
                     </a:stretch>
@@ -1080,8 +1388,8 @@
           <w:rFonts w:ascii="Sakkal Majalla" w:hAnsi="Sakkal Majalla" w:cs="Sakkal Majalla" w:eastAsia="Sakkal Majalla"/>
           <w:b w:val="0"/>
           <w:color w:val="666666"/>
-          <w:sz w:val="24"/>
-          <w:szCs w:val="24"/>
+          <w:sz w:val="28"/>
+          <w:szCs w:val="28"/>
         </w:rPr>
         <w:t>لصق رابط البوابة وكلمة السر</w:t>
       </w:r>
@@ -1096,8 +1404,8 @@
         <w:rPr>
           <w:rFonts w:ascii="Sakkal Majalla" w:hAnsi="Sakkal Majalla" w:cs="Sakkal Majalla" w:eastAsia="Sakkal Majalla"/>
           <w:b w:val="0"/>
-          <w:sz w:val="28"/>
-          <w:szCs w:val="28"/>
+          <w:sz w:val="32"/>
+          <w:szCs w:val="32"/>
         </w:rPr>
         <w:t>أضف الشواهد المطلوبة في الجدول، ثم اضغط «نشر الطلب المكتبي على بوابة المنشأة». يظهر رابط المنشأة، فانسخه وأرسله لها.</w:t>
       </w:r>
@@ -1111,7 +1419,7 @@
         <w:drawing>
           <wp:inline xmlns:a="http://schemas.openxmlformats.org/drawingml/2006/main" xmlns:pic="http://schemas.openxmlformats.org/drawingml/2006/picture">
             <wp:extent cx="5400000" cy="4376471"/>
-            <wp:docPr id="13" name="Picture 13"/>
+            <wp:docPr id="19" name="Picture 19"/>
             <wp:cNvGraphicFramePr>
               <a:graphicFrameLocks noChangeAspect="1"/>
             </wp:cNvGraphicFramePr>
@@ -1123,7 +1431,7 @@
                     <pic:cNvPicPr/>
                   </pic:nvPicPr>
                   <pic:blipFill>
-                    <a:blip r:embed="rId21"/>
+                    <a:blip r:embed="rId23"/>
                     <a:stretch>
                       <a:fillRect/>
                     </a:stretch>
@@ -1153,10 +1461,83 @@
           <w:rFonts w:ascii="Sakkal Majalla" w:hAnsi="Sakkal Majalla" w:cs="Sakkal Majalla" w:eastAsia="Sakkal Majalla"/>
           <w:b w:val="0"/>
           <w:color w:val="666666"/>
-          <w:sz w:val="24"/>
-          <w:szCs w:val="24"/>
+          <w:sz w:val="28"/>
+          <w:szCs w:val="28"/>
         </w:rPr>
         <w:t>نشر الطلب ونسخ رابط المنشأة</w:t>
+      </w:r>
+    </w:p>
+    <w:p>
+      <w:pPr>
+        <w:spacing w:after="60" w:before="0"/>
+        <w:bidi/>
+        <w:jc w:val="right"/>
+      </w:pPr>
+      <w:r>
+        <w:rPr>
+          <w:rFonts w:ascii="Sakkal Majalla" w:hAnsi="Sakkal Majalla" w:cs="Sakkal Majalla" w:eastAsia="Sakkal Majalla"/>
+          <w:b w:val="0"/>
+          <w:sz w:val="32"/>
+          <w:szCs w:val="32"/>
+        </w:rPr>
+        <w:t>تفتح المنشأة الرابط فتظهر لها صفحة البوابة، فترفع كل شاهد في موضعه، ويصل إلى مجلدك مباشرة. ويفتح فريقك الشواهد من زر «بوابة الشواهد» في النموذج.</w:t>
+      </w:r>
+    </w:p>
+    <w:p>
+      <w:pPr>
+        <w:spacing w:after="40"/>
+        <w:jc w:val="center"/>
+      </w:pPr>
+      <w:r>
+        <w:drawing>
+          <wp:inline xmlns:a="http://schemas.openxmlformats.org/drawingml/2006/main" xmlns:pic="http://schemas.openxmlformats.org/drawingml/2006/picture">
+            <wp:extent cx="4680000" cy="5148000"/>
+            <wp:docPr id="20" name="Picture 20"/>
+            <wp:cNvGraphicFramePr>
+              <a:graphicFrameLocks noChangeAspect="1"/>
+            </wp:cNvGraphicFramePr>
+            <a:graphic>
+              <a:graphicData uri="http://schemas.openxmlformats.org/drawingml/2006/picture">
+                <pic:pic>
+                  <pic:nvPicPr>
+                    <pic:cNvPr id="0" name="12-facility.png"/>
+                    <pic:cNvPicPr/>
+                  </pic:nvPicPr>
+                  <pic:blipFill>
+                    <a:blip r:embed="rId24"/>
+                    <a:stretch>
+                      <a:fillRect/>
+                    </a:stretch>
+                  </pic:blipFill>
+                  <pic:spPr>
+                    <a:xfrm>
+                      <a:off x="0" y="0"/>
+                      <a:ext cx="4680000" cy="5148000"/>
+                    </a:xfrm>
+                    <a:prstGeom prst="rect"/>
+                  </pic:spPr>
+                </pic:pic>
+              </a:graphicData>
+            </a:graphic>
+          </wp:inline>
+        </w:drawing>
+      </w:r>
+    </w:p>
+    <w:p>
+      <w:pPr>
+        <w:spacing w:after="160" w:before="0"/>
+        <w:bidi/>
+        <w:jc w:val="center"/>
+      </w:pPr>
+      <w:r>
+        <w:rPr>
+          <w:rFonts w:ascii="Sakkal Majalla" w:hAnsi="Sakkal Majalla" w:cs="Sakkal Majalla" w:eastAsia="Sakkal Majalla"/>
+          <w:b w:val="0"/>
+          <w:color w:val="666666"/>
+          <w:sz w:val="28"/>
+          <w:szCs w:val="28"/>
+        </w:rPr>
+        <w:t>صفحة بوابة الشواهد (عرض توضيحي)</w:t>
       </w:r>
     </w:p>
     <w:p>
@@ -1170,9 +1551,9 @@
           <w:rFonts w:ascii="Sakkal Majalla" w:hAnsi="Sakkal Majalla" w:cs="Sakkal Majalla" w:eastAsia="Sakkal Majalla"/>
           <w:b/>
           <w:color w:val="0D6B63"/>
-          <w:sz w:val="34"/>
+          <w:sz w:val="40"/>
           <w:bCs/>
-          <w:szCs w:val="34"/>
+          <w:szCs w:val="40"/>
         </w:rPr>
         <w:t>عند كل زيارة جديدة</w:t>
       </w:r>
@@ -1187,10 +1568,67 @@
         <w:rPr>
           <w:rFonts w:ascii="Sakkal Majalla" w:hAnsi="Sakkal Majalla" w:cs="Sakkal Majalla" w:eastAsia="Sakkal Majalla"/>
           <w:b w:val="0"/>
+          <w:sz w:val="32"/>
+          <w:szCs w:val="32"/>
+        </w:rPr>
+        <w:t>افتح النموذج من رابط الرئيس، واضغط «بدء زيارة جديدة». تُؤرشف الزيارة السابقة في جدولك. وإن تغيّر أعضاء الفريق فاختر «أنشئ رابطًا جديدًا» فتتوقف روابط الأعضاء القدامى.</w:t>
+      </w:r>
+    </w:p>
+    <w:p>
+      <w:pPr>
+        <w:spacing w:after="40"/>
+        <w:jc w:val="center"/>
+      </w:pPr>
+      <w:r>
+        <w:drawing>
+          <wp:inline xmlns:a="http://schemas.openxmlformats.org/drawingml/2006/main" xmlns:pic="http://schemas.openxmlformats.org/drawingml/2006/picture">
+            <wp:extent cx="4680000" cy="2266105"/>
+            <wp:docPr id="21" name="Picture 21"/>
+            <wp:cNvGraphicFramePr>
+              <a:graphicFrameLocks noChangeAspect="1"/>
+            </wp:cNvGraphicFramePr>
+            <a:graphic>
+              <a:graphicData uri="http://schemas.openxmlformats.org/drawingml/2006/picture">
+                <pic:pic>
+                  <pic:nvPicPr>
+                    <pic:cNvPr id="0" name="11-new-visit.png"/>
+                    <pic:cNvPicPr/>
+                  </pic:nvPicPr>
+                  <pic:blipFill>
+                    <a:blip r:embed="rId25"/>
+                    <a:stretch>
+                      <a:fillRect/>
+                    </a:stretch>
+                  </pic:blipFill>
+                  <pic:spPr>
+                    <a:xfrm>
+                      <a:off x="0" y="0"/>
+                      <a:ext cx="4680000" cy="2266105"/>
+                    </a:xfrm>
+                    <a:prstGeom prst="rect"/>
+                  </pic:spPr>
+                </pic:pic>
+              </a:graphicData>
+            </a:graphic>
+          </wp:inline>
+        </w:drawing>
+      </w:r>
+    </w:p>
+    <w:p>
+      <w:pPr>
+        <w:spacing w:after="160" w:before="0"/>
+        <w:bidi/>
+        <w:jc w:val="center"/>
+      </w:pPr>
+      <w:r>
+        <w:rPr>
+          <w:rFonts w:ascii="Sakkal Majalla" w:hAnsi="Sakkal Majalla" w:cs="Sakkal Majalla" w:eastAsia="Sakkal Majalla"/>
+          <w:b w:val="0"/>
+          <w:color w:val="666666"/>
           <w:sz w:val="28"/>
           <w:szCs w:val="28"/>
         </w:rPr>
-        <w:t>افتح النموذج من رابط الرئيس، واضغط «بدء زيارة جديدة». تُؤرشف الزيارة السابقة في جدولك، ويُنشأ رابط جديد للفريق فتتوقف روابط الأعضاء القدامى.</w:t>
+        <w:t>نافذة بدء زيارة جديدة</w:t>
       </w:r>
     </w:p>
     <w:p>
@@ -1203,8 +1641,8 @@
         <w:rPr>
           <w:rFonts w:ascii="Sakkal Majalla" w:hAnsi="Sakkal Majalla" w:cs="Sakkal Majalla" w:eastAsia="Sakkal Majalla"/>
           <w:b w:val="0"/>
-          <w:sz w:val="28"/>
-          <w:szCs w:val="28"/>
+          <w:sz w:val="32"/>
+          <w:szCs w:val="32"/>
         </w:rPr>
         <w:t>في البوابة تبدأ الزيارة الجديدة من صفحة الرئيس بمنشآتها وشواهدها وموعدها، وتبقى الزيارات السابقة محفوظة في مجلدك.</w:t>
       </w:r>
@@ -1220,9 +1658,9 @@
           <w:rFonts w:ascii="Sakkal Majalla" w:hAnsi="Sakkal Majalla" w:cs="Sakkal Majalla" w:eastAsia="Sakkal Majalla"/>
           <w:b/>
           <w:color w:val="0D6B63"/>
-          <w:sz w:val="34"/>
+          <w:sz w:val="40"/>
           <w:bCs/>
-          <w:szCs w:val="34"/>
+          <w:szCs w:val="40"/>
         </w:rPr>
         <w:t>حقوق النموذج</w:t>
       </w:r>
@@ -1237,8 +1675,8 @@
         <w:rPr>
           <w:rFonts w:ascii="Sakkal Majalla" w:hAnsi="Sakkal Majalla" w:cs="Sakkal Majalla" w:eastAsia="Sakkal Majalla"/>
           <w:b w:val="0"/>
-          <w:sz w:val="28"/>
-          <w:szCs w:val="28"/>
+          <w:sz w:val="32"/>
+          <w:szCs w:val="32"/>
         </w:rPr>
         <w:t>يظهر في آخر كل صفحة شريط الإعداد وحقوق الملكية. إن عُدّل ملف النموذج يتوقف عن العمل.</w:t>
       </w:r>
@@ -1252,7 +1690,7 @@
         <w:drawing>
           <wp:inline xmlns:a="http://schemas.openxmlformats.org/drawingml/2006/main" xmlns:pic="http://schemas.openxmlformats.org/drawingml/2006/picture">
             <wp:extent cx="5760000" cy="247680"/>
-            <wp:docPr id="14" name="Picture 14"/>
+            <wp:docPr id="22" name="Picture 22"/>
             <wp:cNvGraphicFramePr>
               <a:graphicFrameLocks noChangeAspect="1"/>
             </wp:cNvGraphicFramePr>
@@ -1264,7 +1702,7 @@
                     <pic:cNvPicPr/>
                   </pic:nvPicPr>
                   <pic:blipFill>
-                    <a:blip r:embed="rId22"/>
+                    <a:blip r:embed="rId26"/>
                     <a:stretch>
                       <a:fillRect/>
                     </a:stretch>
@@ -1285,6 +1723,96 @@
     </w:p>
     <w:p>
       <w:pPr>
+        <w:spacing w:after="160" w:before="0"/>
+        <w:bidi/>
+        <w:jc w:val="center"/>
+      </w:pPr>
+      <w:r>
+        <w:rPr>
+          <w:rFonts w:ascii="Sakkal Majalla" w:hAnsi="Sakkal Majalla" w:cs="Sakkal Majalla" w:eastAsia="Sakkal Majalla"/>
+          <w:b w:val="0"/>
+          <w:color w:val="666666"/>
+          <w:sz w:val="28"/>
+          <w:szCs w:val="28"/>
+        </w:rPr>
+        <w:t>شريط الحقوق في آخر الصفحة</w:t>
+      </w:r>
+    </w:p>
+    <w:p>
+      <w:pPr>
+        <w:spacing w:after="60" w:before="0"/>
+        <w:bidi/>
+        <w:jc w:val="right"/>
+      </w:pPr>
+      <w:r>
+        <w:rPr>
+          <w:rFonts w:ascii="Sakkal Majalla" w:hAnsi="Sakkal Majalla" w:cs="Sakkal Majalla" w:eastAsia="Sakkal Majalla"/>
+          <w:b w:val="0"/>
+          <w:sz w:val="32"/>
+          <w:szCs w:val="32"/>
+        </w:rPr>
+        <w:t>ويظهر اسم المُعِدّ أيضًا في تذييل كل صفحة من تقرير Word.</w:t>
+      </w:r>
+    </w:p>
+    <w:p>
+      <w:pPr>
+        <w:spacing w:after="40"/>
+        <w:jc w:val="center"/>
+      </w:pPr>
+      <w:r>
+        <w:drawing>
+          <wp:inline xmlns:a="http://schemas.openxmlformats.org/drawingml/2006/main" xmlns:pic="http://schemas.openxmlformats.org/drawingml/2006/picture">
+            <wp:extent cx="5400000" cy="765495"/>
+            <wp:docPr id="23" name="Picture 23"/>
+            <wp:cNvGraphicFramePr>
+              <a:graphicFrameLocks noChangeAspect="1"/>
+            </wp:cNvGraphicFramePr>
+            <a:graphic>
+              <a:graphicData uri="http://schemas.openxmlformats.org/drawingml/2006/picture">
+                <pic:pic>
+                  <pic:nvPicPr>
+                    <pic:cNvPr id="0" name="13-word-footer.png"/>
+                    <pic:cNvPicPr/>
+                  </pic:nvPicPr>
+                  <pic:blipFill>
+                    <a:blip r:embed="rId27"/>
+                    <a:stretch>
+                      <a:fillRect/>
+                    </a:stretch>
+                  </pic:blipFill>
+                  <pic:spPr>
+                    <a:xfrm>
+                      <a:off x="0" y="0"/>
+                      <a:ext cx="5400000" cy="765495"/>
+                    </a:xfrm>
+                    <a:prstGeom prst="rect"/>
+                  </pic:spPr>
+                </pic:pic>
+              </a:graphicData>
+            </a:graphic>
+          </wp:inline>
+        </w:drawing>
+      </w:r>
+    </w:p>
+    <w:p>
+      <w:pPr>
+        <w:spacing w:after="160" w:before="0"/>
+        <w:bidi/>
+        <w:jc w:val="center"/>
+      </w:pPr>
+      <w:r>
+        <w:rPr>
+          <w:rFonts w:ascii="Sakkal Majalla" w:hAnsi="Sakkal Majalla" w:cs="Sakkal Majalla" w:eastAsia="Sakkal Majalla"/>
+          <w:b w:val="0"/>
+          <w:color w:val="666666"/>
+          <w:sz w:val="28"/>
+          <w:szCs w:val="28"/>
+        </w:rPr>
+        <w:t>تذييل تقرير Word</w:t>
+      </w:r>
+    </w:p>
+    <w:p>
+      <w:pPr>
         <w:spacing w:after="60" w:before="200"/>
         <w:bidi/>
         <w:jc w:val="right"/>
@@ -1294,9 +1822,9 @@
           <w:rFonts w:ascii="Sakkal Majalla" w:hAnsi="Sakkal Majalla" w:cs="Sakkal Majalla" w:eastAsia="Sakkal Majalla"/>
           <w:b/>
           <w:color w:val="0D6B63"/>
-          <w:sz w:val="34"/>
+          <w:sz w:val="40"/>
           <w:bCs/>
-          <w:szCs w:val="34"/>
+          <w:szCs w:val="40"/>
         </w:rPr>
         <w:t>للتواصل والاقتراحات</w:t>
       </w:r>
@@ -1311,8 +1839,8 @@
         <w:rPr>
           <w:rFonts w:ascii="Sakkal Majalla" w:hAnsi="Sakkal Majalla" w:cs="Sakkal Majalla" w:eastAsia="Sakkal Majalla"/>
           <w:b w:val="0"/>
-          <w:sz w:val="28"/>
-          <w:szCs w:val="28"/>
+          <w:sz w:val="32"/>
+          <w:szCs w:val="32"/>
         </w:rPr>
         <w:t>يسعدني وصول ملاحظاتك واقتراحاتك على البريد:</w:t>
       </w:r>
@@ -1328,9 +1856,9 @@
           <w:rFonts w:ascii="Sakkal Majalla" w:hAnsi="Sakkal Majalla" w:cs="Sakkal Majalla" w:eastAsia="Sakkal Majalla"/>
           <w:b/>
           <w:color w:val="0D6B63"/>
-          <w:sz w:val="28"/>
+          <w:sz w:val="32"/>
           <w:bCs/>
-          <w:szCs w:val="28"/>
+          <w:szCs w:val="32"/>
           <w:rtl w:val="0"/>
         </w:rPr>
         <w:t>alrabia02@gmail.com</w:t>
@@ -1346,8 +1874,8 @@
         <w:rPr>
           <w:rFonts w:ascii="Sakkal Majalla" w:hAnsi="Sakkal Majalla" w:cs="Sakkal Majalla" w:eastAsia="Sakkal Majalla"/>
           <w:b w:val="0"/>
-          <w:sz w:val="28"/>
-          <w:szCs w:val="28"/>
+          <w:sz w:val="32"/>
+          <w:szCs w:val="32"/>
         </w:rPr>
         <w:t>وأرجو ألا تنساني ووالديّ وأهلي من صالح دعائك.</w:t>
       </w:r>
@@ -1363,11 +1891,11 @@
           <w:rFonts w:ascii="Sakkal Majalla" w:hAnsi="Sakkal Majalla" w:cs="Sakkal Majalla" w:eastAsia="Sakkal Majalla"/>
           <w:b/>
           <w:color w:val="8A6D1D"/>
-          <w:sz w:val="28"/>
+          <w:sz w:val="34"/>
           <w:bCs/>
-          <w:szCs w:val="28"/>
+          <w:szCs w:val="34"/>
         </w:rPr>
-        <w:t>أخوك المهندس/ علي الأحمري</w:t>
+        <w:t>أخوك المهندس/ علي سعد الأحمري</w:t>
       </w:r>
     </w:p>
     <w:sectPr>

</xml_diff>

<commit_message>
share/22m: guide link lines read left to right
Co-Authored-By: Claude Opus 5.5 <noreply@anthropic.com>
Claude-Session: https://claude.ai/code/session_01WenU9YfZxHDgmNpcDVSGAM
</commit_message>
<xml_diff>
--- a/share/22m/دليل-رئيس-الفريق.docx
+++ b/share/22m/دليل-رئيس-الفريق.docx
@@ -232,8 +232,7 @@
     <w:p>
       <w:pPr>
         <w:spacing w:after="80" w:before="0"/>
-        <w:bidi/>
-        <w:jc w:val="right"/>
+        <w:jc w:val="center"/>
       </w:pPr>
       <w:r>
         <w:rPr>
@@ -1848,8 +1847,7 @@
     <w:p>
       <w:pPr>
         <w:spacing w:after="80" w:before="0"/>
-        <w:bidi/>
-        <w:jc w:val="right"/>
+        <w:jc w:val="center"/>
       </w:pPr>
       <w:r>
         <w:rPr>

</xml_diff>

<commit_message>
share/22m: guide paragraphs aligned right to left
Co-Authored-By: Claude Opus 5.5 <noreply@anthropic.com>
Claude-Session: https://claude.ai/code/session_01WenU9YfZxHDgmNpcDVSGAM
</commit_message>
<xml_diff>
--- a/share/22m/دليل-رئيس-الفريق.docx
+++ b/share/22m/دليل-رئيس-الفريق.docx
@@ -76,7 +76,7 @@
       <w:pPr>
         <w:spacing w:after="60" w:before="200"/>
         <w:bidi/>
-        <w:jc w:val="right"/>
+        <w:jc w:val="start"/>
       </w:pPr>
       <w:r>
         <w:rPr>
@@ -94,7 +94,7 @@
       <w:pPr>
         <w:spacing w:after="60" w:before="0"/>
         <w:bidi/>
-        <w:jc w:val="right"/>
+        <w:jc w:val="start"/>
       </w:pPr>
       <w:r>
         <w:rPr>
@@ -110,7 +110,7 @@
       <w:pPr>
         <w:spacing w:after="60" w:before="0"/>
         <w:bidi/>
-        <w:jc w:val="right"/>
+        <w:jc w:val="start"/>
       </w:pPr>
       <w:r>
         <w:rPr>
@@ -183,7 +183,7 @@
       <w:pPr>
         <w:spacing w:after="120" w:before="0"/>
         <w:bidi/>
-        <w:jc w:val="right"/>
+        <w:jc w:val="start"/>
       </w:pPr>
       <w:r>
         <w:rPr>
@@ -199,7 +199,7 @@
       <w:pPr>
         <w:spacing w:after="60" w:before="200"/>
         <w:bidi/>
-        <w:jc w:val="right"/>
+        <w:jc w:val="start"/>
       </w:pPr>
       <w:r>
         <w:rPr>
@@ -217,7 +217,7 @@
       <w:pPr>
         <w:spacing w:after="60" w:before="0"/>
         <w:bidi/>
-        <w:jc w:val="right"/>
+        <w:jc w:val="start"/>
       </w:pPr>
       <w:r>
         <w:rPr>
@@ -251,7 +251,7 @@
       <w:pPr>
         <w:spacing w:after="60" w:before="0"/>
         <w:bidi/>
-        <w:jc w:val="right"/>
+        <w:jc w:val="start"/>
       </w:pPr>
       <w:r>
         <w:rPr>
@@ -381,7 +381,7 @@
       <w:pPr>
         <w:spacing w:after="60" w:before="200"/>
         <w:bidi/>
-        <w:jc w:val="right"/>
+        <w:jc w:val="start"/>
       </w:pPr>
       <w:r>
         <w:rPr>
@@ -399,7 +399,7 @@
       <w:pPr>
         <w:spacing w:after="60" w:before="0"/>
         <w:bidi/>
-        <w:jc w:val="right"/>
+        <w:jc w:val="start"/>
       </w:pPr>
       <w:r>
         <w:rPr>
@@ -472,7 +472,7 @@
       <w:pPr>
         <w:spacing w:after="60" w:before="200"/>
         <w:bidi/>
-        <w:jc w:val="right"/>
+        <w:jc w:val="start"/>
       </w:pPr>
       <w:r>
         <w:rPr>
@@ -490,7 +490,7 @@
       <w:pPr>
         <w:spacing w:after="60" w:before="0"/>
         <w:bidi/>
-        <w:jc w:val="right"/>
+        <w:jc w:val="start"/>
       </w:pPr>
       <w:r>
         <w:rPr>
@@ -563,7 +563,7 @@
       <w:pPr>
         <w:spacing w:after="60" w:before="0"/>
         <w:bidi/>
-        <w:jc w:val="right"/>
+        <w:jc w:val="start"/>
       </w:pPr>
       <w:r>
         <w:rPr>
@@ -619,7 +619,7 @@
       <w:pPr>
         <w:spacing w:after="60" w:before="0"/>
         <w:bidi/>
-        <w:jc w:val="right"/>
+        <w:jc w:val="start"/>
       </w:pPr>
       <w:r>
         <w:rPr>
@@ -675,7 +675,7 @@
       <w:pPr>
         <w:spacing w:after="60" w:before="0"/>
         <w:bidi/>
-        <w:jc w:val="right"/>
+        <w:jc w:val="start"/>
       </w:pPr>
       <w:r>
         <w:rPr>
@@ -771,7 +771,7 @@
       <w:pPr>
         <w:spacing w:after="60" w:before="0"/>
         <w:bidi/>
-        <w:jc w:val="right"/>
+        <w:jc w:val="start"/>
       </w:pPr>
       <w:r>
         <w:rPr>
@@ -844,7 +844,7 @@
       <w:pPr>
         <w:spacing w:after="60" w:before="200"/>
         <w:bidi/>
-        <w:jc w:val="right"/>
+        <w:jc w:val="start"/>
       </w:pPr>
       <w:r>
         <w:rPr>
@@ -862,7 +862,7 @@
       <w:pPr>
         <w:spacing w:after="60" w:before="0"/>
         <w:bidi/>
-        <w:jc w:val="right"/>
+        <w:jc w:val="start"/>
       </w:pPr>
       <w:r>
         <w:rPr>
@@ -878,7 +878,7 @@
       <w:pPr>
         <w:spacing w:after="60" w:before="0"/>
         <w:bidi/>
-        <w:jc w:val="right"/>
+        <w:jc w:val="start"/>
       </w:pPr>
       <w:r>
         <w:rPr>
@@ -951,7 +951,7 @@
       <w:pPr>
         <w:spacing w:after="60" w:before="200"/>
         <w:bidi/>
-        <w:jc w:val="right"/>
+        <w:jc w:val="start"/>
       </w:pPr>
       <w:r>
         <w:rPr>
@@ -969,7 +969,7 @@
       <w:pPr>
         <w:spacing w:after="60" w:before="0"/>
         <w:bidi/>
-        <w:jc w:val="right"/>
+        <w:jc w:val="start"/>
       </w:pPr>
       <w:r>
         <w:rPr>
@@ -1042,7 +1042,7 @@
       <w:pPr>
         <w:spacing w:after="60" w:before="0"/>
         <w:bidi/>
-        <w:jc w:val="right"/>
+        <w:jc w:val="start"/>
       </w:pPr>
       <w:r>
         <w:rPr>
@@ -1172,7 +1172,7 @@
       <w:pPr>
         <w:spacing w:after="60" w:before="0"/>
         <w:bidi/>
-        <w:jc w:val="right"/>
+        <w:jc w:val="start"/>
       </w:pPr>
       <w:r>
         <w:rPr>
@@ -1228,7 +1228,7 @@
       <w:pPr>
         <w:spacing w:after="60" w:before="0"/>
         <w:bidi/>
-        <w:jc w:val="right"/>
+        <w:jc w:val="start"/>
       </w:pPr>
       <w:r>
         <w:rPr>
@@ -1324,7 +1324,7 @@
       <w:pPr>
         <w:spacing w:after="60" w:before="0"/>
         <w:bidi/>
-        <w:jc w:val="right"/>
+        <w:jc w:val="start"/>
       </w:pPr>
       <w:r>
         <w:rPr>
@@ -1397,7 +1397,7 @@
       <w:pPr>
         <w:spacing w:after="60" w:before="0"/>
         <w:bidi/>
-        <w:jc w:val="right"/>
+        <w:jc w:val="start"/>
       </w:pPr>
       <w:r>
         <w:rPr>
@@ -1470,7 +1470,7 @@
       <w:pPr>
         <w:spacing w:after="60" w:before="0"/>
         <w:bidi/>
-        <w:jc w:val="right"/>
+        <w:jc w:val="start"/>
       </w:pPr>
       <w:r>
         <w:rPr>
@@ -1543,7 +1543,7 @@
       <w:pPr>
         <w:spacing w:after="60" w:before="200"/>
         <w:bidi/>
-        <w:jc w:val="right"/>
+        <w:jc w:val="start"/>
       </w:pPr>
       <w:r>
         <w:rPr>
@@ -1561,7 +1561,7 @@
       <w:pPr>
         <w:spacing w:after="60" w:before="0"/>
         <w:bidi/>
-        <w:jc w:val="right"/>
+        <w:jc w:val="start"/>
       </w:pPr>
       <w:r>
         <w:rPr>
@@ -1634,7 +1634,7 @@
       <w:pPr>
         <w:spacing w:after="120" w:before="0"/>
         <w:bidi/>
-        <w:jc w:val="right"/>
+        <w:jc w:val="start"/>
       </w:pPr>
       <w:r>
         <w:rPr>
@@ -1650,7 +1650,7 @@
       <w:pPr>
         <w:spacing w:after="60" w:before="200"/>
         <w:bidi/>
-        <w:jc w:val="right"/>
+        <w:jc w:val="start"/>
       </w:pPr>
       <w:r>
         <w:rPr>
@@ -1668,7 +1668,7 @@
       <w:pPr>
         <w:spacing w:after="60" w:before="0"/>
         <w:bidi/>
-        <w:jc w:val="right"/>
+        <w:jc w:val="start"/>
       </w:pPr>
       <w:r>
         <w:rPr>
@@ -1741,7 +1741,7 @@
       <w:pPr>
         <w:spacing w:after="60" w:before="0"/>
         <w:bidi/>
-        <w:jc w:val="right"/>
+        <w:jc w:val="start"/>
       </w:pPr>
       <w:r>
         <w:rPr>
@@ -1814,7 +1814,7 @@
       <w:pPr>
         <w:spacing w:after="60" w:before="200"/>
         <w:bidi/>
-        <w:jc w:val="right"/>
+        <w:jc w:val="start"/>
       </w:pPr>
       <w:r>
         <w:rPr>
@@ -1832,7 +1832,7 @@
       <w:pPr>
         <w:spacing w:after="60" w:before="0"/>
         <w:bidi/>
-        <w:jc w:val="right"/>
+        <w:jc w:val="start"/>
       </w:pPr>
       <w:r>
         <w:rPr>
@@ -1866,7 +1866,7 @@
       <w:pPr>
         <w:spacing w:after="60" w:before="0"/>
         <w:bidi/>
-        <w:jc w:val="right"/>
+        <w:jc w:val="start"/>
       </w:pPr>
       <w:r>
         <w:rPr>
@@ -1882,7 +1882,7 @@
       <w:pPr>
         <w:spacing w:after="0" w:before="0"/>
         <w:bidi/>
-        <w:jc w:val="right"/>
+        <w:jc w:val="start"/>
       </w:pPr>
       <w:r>
         <w:rPr>

</xml_diff>